<commit_message>
agregando informe completo hasta el momento
</commit_message>
<xml_diff>
--- a/reports/Pre_Entrega_3_YPF.docx
+++ b/reports/Pre_Entrega_3_YPF.docx
@@ -388,14 +388,6 @@
     </w:tbl>
     <w:p>
       <w:pPr>
-        <w:spacing w:after="160"/>
-      </w:pPr>
-      <w:r>
-        <w:t xml:space="preserve">La verificación visual sobre el pozo con más historia confirmó que la producción acumulada es siempre creciente y que la curva mensual sigue el patrón esperable de un pozo no convencional. Se detectó, en ese mismo pozo, un pico de producción puntual (posible reestimulación/refractura), señalado como punto de atención para el modelado.</w:t>
-      </w:r>
-    </w:p>
-    <w:p>
-      <w:pPr>
         <w:pStyle w:val="Heading1"/>
         <w:spacing w:after="150" w:before="300"/>
       </w:pPr>
@@ -426,7 +418,7 @@
         <w:spacing w:after="80"/>
       </w:pPr>
       <w:r>
-        <w:t xml:space="preserve">Modelo: XGBoost (XGBRegressor), parámetros base sin optimizar (n_estimators=200, max_depth=5, learning_rate=0.1).</w:t>
+        <w:t xml:space="preserve">Modelos: XGBoost (XGBRegressor) y LightGBM (LGBMRegressor), parámetros base equivalentes (n_estimators=200, max_depth=5, learning_rate=0.1).</w:t>
       </w:r>
     </w:p>
     <w:p>
@@ -461,7 +453,7 @@
         <w:spacing w:after="150" w:before="300"/>
       </w:pPr>
       <w:r>
-        <w:t xml:space="preserve">3. Iteración 1 — Modelo Base (7 features)</w:t>
+        <w:t xml:space="preserve">3. Iteración 1 — Modelo Base (7 features, XGBoost)</w:t>
       </w:r>
     </w:p>
     <w:p>
@@ -484,7 +476,7 @@
         <w:t xml:space="preserve">Resultado: </w:t>
       </w:r>
       <w:r>
-        <w:t xml:space="preserve">MAE 195,11 — RMSE 520,31 — R² 0,853. Buen ajuste en el rango bajo-medio de producción, pero subestimación sistemática de los pozos con picos muy altos (&gt;10.000). prod_pet_mes_anterior concentró más del 90% de la importancia.</w:t>
+        <w:t xml:space="preserve">MAE 195,11 — RMSE 520,31 — R² 0,853. Buen ajuste en el rango bajo-medio de producción, pero subestimación sistemática de los pozos con picos muy altos (&gt;10.000).</w:t>
       </w:r>
     </w:p>
     <w:p>
@@ -516,15 +508,7 @@
         <w:t xml:space="preserve">Diagnóstico: </w:t>
       </w:r>
       <w:r>
-        <w:t xml:space="preserve">declinacion_pet se calcula como (prod_pet − prod_pet_mes_anterior) / prod_pet_mes_anterior. La variable objetivo queda embebida en la fórmula de la propia feature, por lo que prod_pet se puede despejar algebraicamente combinando las dos variables. El modelo no predecía: recibía la respuesta disfrazada.</w:t>
-      </w:r>
-    </w:p>
-    <w:p>
-      <w:pPr>
-        <w:spacing w:after="160"/>
-      </w:pPr>
-      <w:r>
-        <w:t xml:space="preserve">Se confirmó observando que, pese al R² casi perfecto, el error en picos altos seguía siendo grande (2.580 en promedio). Descartada: no es utilizable en producción, ya que requiere conocer de antemano el dato que se busca estimar.</w:t>
+        <w:t xml:space="preserve">declinacion_pet se calcula como (prod_pet − prod_pet_mes_anterior) / prod_pet_mes_anterior. La variable objetivo queda embebida en la fórmula de la propia feature, por lo que prod_pet se puede despejar algebraicamente. El modelo no predecía: recibía la respuesta disfrazada. Descartada.</w:t>
       </w:r>
     </w:p>
     <w:p>
@@ -533,7 +517,7 @@
         <w:spacing w:after="150" w:before="300"/>
       </w:pPr>
       <w:r>
-        <w:t xml:space="preserve">5. Iteración 3 — Modelo Corregido (8 features)</w:t>
+        <w:t xml:space="preserve">5. Iteración 3 — Modelo Corregido (8 features, XGBoost)</w:t>
       </w:r>
     </w:p>
     <w:p>
@@ -541,7 +525,7 @@
         <w:spacing w:after="160"/>
       </w:pPr>
       <w:r>
-        <w:t xml:space="preserve">Se reemplazó la variable con fuga por declinacion_pet_anterior (declinación del mes anterior al anterior — información ya conocida al momento de predecir, sin fuga).</w:t>
+        <w:t xml:space="preserve">Se reemplazó la variable con fuga por declinacion_pet_anterior (declinación del mes anterior al anterior — sin fuga).</w:t>
       </w:r>
     </w:p>
     <w:p>
@@ -556,7 +540,7 @@
         <w:t xml:space="preserve">Resultado: </w:t>
       </w:r>
       <w:r>
-        <w:t xml:space="preserve">MAE 163,33 — RMSE 445,42 — R² 0,885. Mejora real y modesta respecto al modelo base. declinacion_pet_anterior aparece como tercera variable en importancia, sin dominar el modelo. El problema de subestimación de picos altos persistía.</w:t>
+        <w:t xml:space="preserve">MAE 163,33 — RMSE 445,42 — R² 0,885. Mejora real y modesta. El problema de subestimación de picos altos persistía.</w:t>
       </w:r>
     </w:p>
     <w:p>
@@ -573,7 +557,7 @@
         <w:spacing w:after="160"/>
       </w:pPr>
       <w:r>
-        <w:t xml:space="preserve">Se agregó prod_pet_maxima_anterior (máximo histórico de producción del pozo, calculado sin fuga de datos), con la hipótesis de que ayudaría al modelo a anticipar pozos con antecedentes de picos.</w:t>
+        <w:t xml:space="preserve">Se agregó prod_pet_maxima_anterior (máximo histórico de producción del pozo, sin fuga de datos).</w:t>
       </w:r>
     </w:p>
     <w:p>
@@ -588,7 +572,7 @@
         <w:t xml:space="preserve">Resultado: </w:t>
       </w:r>
       <w:r>
-        <w:t xml:space="preserve">MAE 165,63 — RMSE 444,47 — R² 0,885. Prácticamente idéntico a la iteración 3; el gráfico de importancia mostró que el modelo casi no utilizó esta variable. Descartada por no aportar mejora real, priorizando un modelo más simple.</w:t>
+        <w:t xml:space="preserve">MAE 165,63 — RMSE 444,47 — R² 0,885. Prácticamente idéntico a la iteración 3; el modelo casi no utilizó esta variable. Descartada por no aportar mejora real.</w:t>
       </w:r>
     </w:p>
     <w:p>
@@ -605,7 +589,7 @@
         <w:spacing w:after="160"/>
       </w:pPr>
       <w:r>
-        <w:t xml:space="preserve">En vez de agregar otra variable, se entrenó el modelo sobre log(1 + prod_pet), una técnica estándar para atenuar el efecto de distribuciones sesgadas sobre el error cuadrático.</w:t>
+        <w:t xml:space="preserve">Se entrenó el modelo sobre log(1 + prod_pet) en vez del valor directo, buscando atenuar el sesgo hacia los valores bajos.</w:t>
       </w:r>
     </w:p>
     <w:p>
@@ -620,7 +604,7 @@
         <w:t xml:space="preserve">Resultado: </w:t>
       </w:r>
       <w:r>
-        <w:t xml:space="preserve">MAE 163,09 — RMSE 501,67 — R² 0,854. El RMSE empeoró y el error en picos altos subió a 6.028. El gráfico de real vs. predicho reveló el motivo: al revertir el logaritmo, pequeños errores en escala logarítmica se amplifican exponencialmente, generando sobreestimaciones extremas (predicciones de hasta 35.000 para pozos que producían realmente 7.000-10.000). Descartada por introducir un problema nuevo y más grave que el original.</w:t>
+        <w:t xml:space="preserve">MAE 163,09 — RMSE 501,67 — R² 0,854. El RMSE empeoró y aparecieron sobreestimaciones extremas (hasta 35.000 para pozos que producían 7.000-10.000 reales), por la amplificación del error al revertir el logaritmo. Descartada por introducir un problema más grave que el original.</w:t>
       </w:r>
     </w:p>
     <w:p>
@@ -629,7 +613,7 @@
         <w:spacing w:after="150" w:before="300"/>
       </w:pPr>
       <w:r>
-        <w:t xml:space="preserve">8. Modelo Final y Tabla Comparativa</w:t>
+        <w:t xml:space="preserve">8. Iteración 6 — Comparación XGBoost vs. LightGBM</w:t>
       </w:r>
     </w:p>
     <w:p>
@@ -637,7 +621,7 @@
         <w:spacing w:after="160"/>
       </w:pPr>
       <w:r>
-        <w:t xml:space="preserve">Tras 4 iteraciones sobre el modelo base, la combinación ganadora es la de la Iteración 3 (8 features, entrenamiento directo sobre prod_pet, sin log-transform ni variable de máximo histórico) — la mejor relación entre métricas y simplicidad.</w:t>
+        <w:t xml:space="preserve">La Pre-Entrega 1 especificaba entrenar y comparar modelos de regresión (XGBoost / LightGBM). Se entrenó LightGBM con las mismas 8 features de la Iteración 3, el mismo split temporal y parámetros equivalentes, para una comparación justa.</w:t>
       </w:r>
     </w:p>
     <w:tbl>
@@ -653,17 +637,14 @@
         </w:tblBorders>
       </w:tblPr>
       <w:tblGrid>
-        <w:gridCol w:w="1560"/>
-        <w:gridCol w:w="1560"/>
-        <w:gridCol w:w="1560"/>
-        <w:gridCol w:w="1560"/>
-        <w:gridCol w:w="1560"/>
-        <w:gridCol w:w="1560"/>
+        <w:gridCol w:w="3120"/>
+        <w:gridCol w:w="3120"/>
+        <w:gridCol w:w="3120"/>
       </w:tblGrid>
       <w:tr>
         <w:tc>
           <w:tcPr>
-            <w:tcW w:type="dxa" w:w="1560"/>
+            <w:tcW w:type="dxa" w:w="3120"/>
             <w:shd w:fill="D9E2F3" w:val="clear"/>
           </w:tcPr>
           <w:p>
@@ -678,7 +659,7 @@
         </w:tc>
         <w:tc>
           <w:tcPr>
-            <w:tcW w:type="dxa" w:w="1560"/>
+            <w:tcW w:type="dxa" w:w="3120"/>
             <w:shd w:fill="D9E2F3" w:val="clear"/>
           </w:tcPr>
           <w:p>
@@ -687,13 +668,13 @@
                 <w:b/>
                 <w:bCs/>
               </w:rPr>
-              <w:t xml:space="preserve">Base (7 feat.)</w:t>
-            </w:r>
-          </w:p>
-        </w:tc>
-        <w:tc>
-          <w:tcPr>
-            <w:tcW w:type="dxa" w:w="1560"/>
+              <w:t xml:space="preserve">XGBoost</w:t>
+            </w:r>
+          </w:p>
+        </w:tc>
+        <w:tc>
+          <w:tcPr>
+            <w:tcW w:type="dxa" w:w="3120"/>
             <w:shd w:fill="D9E2F3" w:val="clear"/>
           </w:tcPr>
           <w:p>
@@ -702,13 +683,253 @@
                 <w:b/>
                 <w:bCs/>
               </w:rPr>
-              <w:t xml:space="preserve">Con fuga (desc.)</w:t>
-            </w:r>
-          </w:p>
-        </w:tc>
-        <w:tc>
-          <w:tcPr>
-            <w:tcW w:type="dxa" w:w="1560"/>
+              <w:t xml:space="preserve">LightGBM</w:t>
+            </w:r>
+          </w:p>
+        </w:tc>
+      </w:tr>
+      <w:tr>
+        <w:tc>
+          <w:tcPr>
+            <w:tcW w:type="dxa" w:w="3120"/>
+          </w:tcPr>
+          <w:p>
+            <w:r>
+              <w:rPr>
+                <w:b w:val="false"/>
+                <w:bCs w:val="false"/>
+              </w:rPr>
+              <w:t xml:space="preserve">MAE</w:t>
+            </w:r>
+          </w:p>
+        </w:tc>
+        <w:tc>
+          <w:tcPr>
+            <w:tcW w:type="dxa" w:w="3120"/>
+          </w:tcPr>
+          <w:p>
+            <w:r>
+              <w:rPr>
+                <w:b w:val="false"/>
+                <w:bCs w:val="false"/>
+              </w:rPr>
+              <w:t xml:space="preserve">163,33</w:t>
+            </w:r>
+          </w:p>
+        </w:tc>
+        <w:tc>
+          <w:tcPr>
+            <w:tcW w:type="dxa" w:w="3120"/>
+          </w:tcPr>
+          <w:p>
+            <w:r>
+              <w:rPr>
+                <w:b w:val="false"/>
+                <w:bCs w:val="false"/>
+              </w:rPr>
+              <w:t xml:space="preserve">163,86</w:t>
+            </w:r>
+          </w:p>
+        </w:tc>
+      </w:tr>
+      <w:tr>
+        <w:tc>
+          <w:tcPr>
+            <w:tcW w:type="dxa" w:w="3120"/>
+          </w:tcPr>
+          <w:p>
+            <w:r>
+              <w:rPr>
+                <w:b w:val="false"/>
+                <w:bCs w:val="false"/>
+              </w:rPr>
+              <w:t xml:space="preserve">RMSE</w:t>
+            </w:r>
+          </w:p>
+        </w:tc>
+        <w:tc>
+          <w:tcPr>
+            <w:tcW w:type="dxa" w:w="3120"/>
+          </w:tcPr>
+          <w:p>
+            <w:r>
+              <w:rPr>
+                <w:b w:val="false"/>
+                <w:bCs w:val="false"/>
+              </w:rPr>
+              <w:t xml:space="preserve">445,42</w:t>
+            </w:r>
+          </w:p>
+        </w:tc>
+        <w:tc>
+          <w:tcPr>
+            <w:tcW w:type="dxa" w:w="3120"/>
+          </w:tcPr>
+          <w:p>
+            <w:r>
+              <w:rPr>
+                <w:b w:val="false"/>
+                <w:bCs w:val="false"/>
+              </w:rPr>
+              <w:t xml:space="preserve">439,34</w:t>
+            </w:r>
+          </w:p>
+        </w:tc>
+      </w:tr>
+      <w:tr>
+        <w:tc>
+          <w:tcPr>
+            <w:tcW w:type="dxa" w:w="3120"/>
+          </w:tcPr>
+          <w:p>
+            <w:r>
+              <w:rPr>
+                <w:b w:val="false"/>
+                <w:bCs w:val="false"/>
+              </w:rPr>
+              <w:t xml:space="preserve">R²</w:t>
+            </w:r>
+          </w:p>
+        </w:tc>
+        <w:tc>
+          <w:tcPr>
+            <w:tcW w:type="dxa" w:w="3120"/>
+          </w:tcPr>
+          <w:p>
+            <w:r>
+              <w:rPr>
+                <w:b w:val="false"/>
+                <w:bCs w:val="false"/>
+              </w:rPr>
+              <w:t xml:space="preserve">0,885</w:t>
+            </w:r>
+          </w:p>
+        </w:tc>
+        <w:tc>
+          <w:tcPr>
+            <w:tcW w:type="dxa" w:w="3120"/>
+          </w:tcPr>
+          <w:p>
+            <w:r>
+              <w:rPr>
+                <w:b w:val="false"/>
+                <w:bCs w:val="false"/>
+              </w:rPr>
+              <w:t xml:space="preserve">0,888</w:t>
+            </w:r>
+          </w:p>
+        </w:tc>
+      </w:tr>
+      <w:tr>
+        <w:tc>
+          <w:tcPr>
+            <w:tcW w:type="dxa" w:w="3120"/>
+          </w:tcPr>
+          <w:p>
+            <w:r>
+              <w:rPr>
+                <w:b w:val="false"/>
+                <w:bCs w:val="false"/>
+              </w:rPr>
+              <w:t xml:space="preserve">Error en picos altos (&gt;10.000)</w:t>
+            </w:r>
+          </w:p>
+        </w:tc>
+        <w:tc>
+          <w:tcPr>
+            <w:tcW w:type="dxa" w:w="3120"/>
+          </w:tcPr>
+          <w:p>
+            <w:r>
+              <w:rPr>
+                <w:b w:val="false"/>
+                <w:bCs w:val="false"/>
+              </w:rPr>
+              <w:t xml:space="preserve">5.153,7</w:t>
+            </w:r>
+          </w:p>
+        </w:tc>
+        <w:tc>
+          <w:tcPr>
+            <w:tcW w:type="dxa" w:w="3120"/>
+          </w:tcPr>
+          <w:p>
+            <w:r>
+              <w:rPr>
+                <w:b w:val="false"/>
+                <w:bCs w:val="false"/>
+              </w:rPr>
+              <w:t xml:space="preserve">4.998,2</w:t>
+            </w:r>
+          </w:p>
+        </w:tc>
+      </w:tr>
+    </w:tbl>
+    <w:p>
+      <w:pPr>
+        <w:spacing w:after="160"/>
+      </w:pPr>
+      <w:r>
+        <w:rPr>
+          <w:b/>
+          <w:bCs/>
+        </w:rPr>
+        <w:t xml:space="preserve">Resultado: </w:t>
+      </w:r>
+      <w:r>
+        <w:t xml:space="preserve">empate técnico, con ventaja marginal pero consistente de LightGBM en 3 de las 4 métricas. Se adopta LightGBM como modelo principal, conservando ambos modelos por separado para trazabilidad.</w:t>
+      </w:r>
+    </w:p>
+    <w:p>
+      <w:pPr>
+        <w:spacing w:after="160"/>
+      </w:pPr>
+      <w:r>
+        <w:t xml:space="preserve">Nota metodológica: los gráficos de importancia de variables de XGBoost (escala 0-1, basada en gain) y LightGBM (escala 0-1000, basada en split por defecto) usan métricas distintas y no son directamente comparables — la diferencia de escala no implica que un modelo haya "entendido mejor" los datos. Ambos coinciden en que prod_pet_mes_anterior es la variable dominante.</w:t>
+      </w:r>
+    </w:p>
+    <w:p>
+      <w:pPr>
+        <w:pStyle w:val="Heading1"/>
+        <w:spacing w:after="150" w:before="300"/>
+      </w:pPr>
+      <w:r>
+        <w:t xml:space="preserve">9. Modelo Final y Tabla Comparativa Completa</w:t>
+      </w:r>
+    </w:p>
+    <w:p>
+      <w:pPr>
+        <w:spacing w:after="160"/>
+      </w:pPr>
+      <w:r>
+        <w:t xml:space="preserve">Tras 5 iteraciones sobre el modelo base, la combinación ganadora es LightGBM con las 8 features de la Iteración 3.</w:t>
+      </w:r>
+    </w:p>
+    <w:tbl>
+      <w:tblPr>
+        <w:tblW w:type="dxa" w:w="9360"/>
+        <w:tblBorders>
+          <w:top w:val="single" w:color="auto" w:sz="4"/>
+          <w:left w:val="single" w:color="auto" w:sz="4"/>
+          <w:bottom w:val="single" w:color="auto" w:sz="4"/>
+          <w:right w:val="single" w:color="auto" w:sz="4"/>
+          <w:insideH w:val="single" w:color="auto" w:sz="4"/>
+          <w:insideV w:val="single" w:color="auto" w:sz="4"/>
+        </w:tblBorders>
+      </w:tblPr>
+      <w:tblGrid>
+        <w:gridCol w:w="1340"/>
+        <w:gridCol w:w="1340"/>
+        <w:gridCol w:w="1340"/>
+        <w:gridCol w:w="1340"/>
+        <w:gridCol w:w="1340"/>
+        <w:gridCol w:w="1340"/>
+        <w:gridCol w:w="1340"/>
+      </w:tblGrid>
+      <w:tr>
+        <w:tc>
+          <w:tcPr>
+            <w:tcW w:type="dxa" w:w="1340"/>
             <w:shd w:fill="D9E2F3" w:val="clear"/>
           </w:tcPr>
           <w:p>
@@ -717,13 +938,13 @@
                 <w:b/>
                 <w:bCs/>
               </w:rPr>
-              <w:t xml:space="preserve">+ máxima (desc.)</w:t>
-            </w:r>
-          </w:p>
-        </w:tc>
-        <w:tc>
-          <w:tcPr>
-            <w:tcW w:type="dxa" w:w="1560"/>
+              <w:t xml:space="preserve">Métrica</w:t>
+            </w:r>
+          </w:p>
+        </w:tc>
+        <w:tc>
+          <w:tcPr>
+            <w:tcW w:type="dxa" w:w="1340"/>
             <w:shd w:fill="D9E2F3" w:val="clear"/>
           </w:tcPr>
           <w:p>
@@ -732,13 +953,13 @@
                 <w:b/>
                 <w:bCs/>
               </w:rPr>
-              <w:t xml:space="preserve">Log-transform (desc.)</w:t>
-            </w:r>
-          </w:p>
-        </w:tc>
-        <w:tc>
-          <w:tcPr>
-            <w:tcW w:type="dxa" w:w="1560"/>
+              <w:t xml:space="preserve">Base</w:t>
+            </w:r>
+          </w:p>
+        </w:tc>
+        <w:tc>
+          <w:tcPr>
+            <w:tcW w:type="dxa" w:w="1340"/>
             <w:shd w:fill="D9E2F3" w:val="clear"/>
           </w:tcPr>
           <w:p>
@@ -747,15 +968,75 @@
                 <w:b/>
                 <w:bCs/>
               </w:rPr>
-              <w:t xml:space="preserve">FINAL (8 feat.)</w:t>
-            </w:r>
-          </w:p>
-        </w:tc>
-      </w:tr>
-      <w:tr>
-        <w:tc>
-          <w:tcPr>
-            <w:tcW w:type="dxa" w:w="1560"/>
+              <w:t xml:space="preserve">Con fuga (desc.)</w:t>
+            </w:r>
+          </w:p>
+        </w:tc>
+        <w:tc>
+          <w:tcPr>
+            <w:tcW w:type="dxa" w:w="1340"/>
+            <w:shd w:fill="D9E2F3" w:val="clear"/>
+          </w:tcPr>
+          <w:p>
+            <w:r>
+              <w:rPr>
+                <w:b/>
+                <w:bCs/>
+              </w:rPr>
+              <w:t xml:space="preserve">+ máxima (desc.)</w:t>
+            </w:r>
+          </w:p>
+        </w:tc>
+        <w:tc>
+          <w:tcPr>
+            <w:tcW w:type="dxa" w:w="1340"/>
+            <w:shd w:fill="D9E2F3" w:val="clear"/>
+          </w:tcPr>
+          <w:p>
+            <w:r>
+              <w:rPr>
+                <w:b/>
+                <w:bCs/>
+              </w:rPr>
+              <w:t xml:space="preserve">Log-transf. (desc.)</w:t>
+            </w:r>
+          </w:p>
+        </w:tc>
+        <w:tc>
+          <w:tcPr>
+            <w:tcW w:type="dxa" w:w="1340"/>
+            <w:shd w:fill="D9E2F3" w:val="clear"/>
+          </w:tcPr>
+          <w:p>
+            <w:r>
+              <w:rPr>
+                <w:b/>
+                <w:bCs/>
+              </w:rPr>
+              <w:t xml:space="preserve">XGBoost</w:t>
+            </w:r>
+          </w:p>
+        </w:tc>
+        <w:tc>
+          <w:tcPr>
+            <w:tcW w:type="dxa" w:w="1340"/>
+            <w:shd w:fill="D9E2F3" w:val="clear"/>
+          </w:tcPr>
+          <w:p>
+            <w:r>
+              <w:rPr>
+                <w:b/>
+                <w:bCs/>
+              </w:rPr>
+              <w:t xml:space="preserve">LightGBM FINAL</w:t>
+            </w:r>
+          </w:p>
+        </w:tc>
+      </w:tr>
+      <w:tr>
+        <w:tc>
+          <w:tcPr>
+            <w:tcW w:type="dxa" w:w="1340"/>
           </w:tcPr>
           <w:p>
             <w:r>
@@ -769,7 +1050,7 @@
         </w:tc>
         <w:tc>
           <w:tcPr>
-            <w:tcW w:type="dxa" w:w="1560"/>
+            <w:tcW w:type="dxa" w:w="1340"/>
           </w:tcPr>
           <w:p>
             <w:r>
@@ -783,7 +1064,7 @@
         </w:tc>
         <w:tc>
           <w:tcPr>
-            <w:tcW w:type="dxa" w:w="1560"/>
+            <w:tcW w:type="dxa" w:w="1340"/>
           </w:tcPr>
           <w:p>
             <w:r>
@@ -797,7 +1078,7 @@
         </w:tc>
         <w:tc>
           <w:tcPr>
-            <w:tcW w:type="dxa" w:w="1560"/>
+            <w:tcW w:type="dxa" w:w="1340"/>
           </w:tcPr>
           <w:p>
             <w:r>
@@ -811,7 +1092,7 @@
         </w:tc>
         <w:tc>
           <w:tcPr>
-            <w:tcW w:type="dxa" w:w="1560"/>
+            <w:tcW w:type="dxa" w:w="1340"/>
           </w:tcPr>
           <w:p>
             <w:r>
@@ -825,7 +1106,7 @@
         </w:tc>
         <w:tc>
           <w:tcPr>
-            <w:tcW w:type="dxa" w:w="1560"/>
+            <w:tcW w:type="dxa" w:w="1340"/>
           </w:tcPr>
           <w:p>
             <w:r>
@@ -837,11 +1118,25 @@
             </w:r>
           </w:p>
         </w:tc>
-      </w:tr>
-      <w:tr>
-        <w:tc>
-          <w:tcPr>
-            <w:tcW w:type="dxa" w:w="1560"/>
+        <w:tc>
+          <w:tcPr>
+            <w:tcW w:type="dxa" w:w="1340"/>
+          </w:tcPr>
+          <w:p>
+            <w:r>
+              <w:rPr>
+                <w:b w:val="false"/>
+                <w:bCs w:val="false"/>
+              </w:rPr>
+              <w:t xml:space="preserve">163,86</w:t>
+            </w:r>
+          </w:p>
+        </w:tc>
+      </w:tr>
+      <w:tr>
+        <w:tc>
+          <w:tcPr>
+            <w:tcW w:type="dxa" w:w="1340"/>
           </w:tcPr>
           <w:p>
             <w:r>
@@ -855,7 +1150,7 @@
         </w:tc>
         <w:tc>
           <w:tcPr>
-            <w:tcW w:type="dxa" w:w="1560"/>
+            <w:tcW w:type="dxa" w:w="1340"/>
           </w:tcPr>
           <w:p>
             <w:r>
@@ -869,7 +1164,7 @@
         </w:tc>
         <w:tc>
           <w:tcPr>
-            <w:tcW w:type="dxa" w:w="1560"/>
+            <w:tcW w:type="dxa" w:w="1340"/>
           </w:tcPr>
           <w:p>
             <w:r>
@@ -883,7 +1178,7 @@
         </w:tc>
         <w:tc>
           <w:tcPr>
-            <w:tcW w:type="dxa" w:w="1560"/>
+            <w:tcW w:type="dxa" w:w="1340"/>
           </w:tcPr>
           <w:p>
             <w:r>
@@ -897,7 +1192,7 @@
         </w:tc>
         <w:tc>
           <w:tcPr>
-            <w:tcW w:type="dxa" w:w="1560"/>
+            <w:tcW w:type="dxa" w:w="1340"/>
           </w:tcPr>
           <w:p>
             <w:r>
@@ -911,7 +1206,7 @@
         </w:tc>
         <w:tc>
           <w:tcPr>
-            <w:tcW w:type="dxa" w:w="1560"/>
+            <w:tcW w:type="dxa" w:w="1340"/>
           </w:tcPr>
           <w:p>
             <w:r>
@@ -923,11 +1218,25 @@
             </w:r>
           </w:p>
         </w:tc>
-      </w:tr>
-      <w:tr>
-        <w:tc>
-          <w:tcPr>
-            <w:tcW w:type="dxa" w:w="1560"/>
+        <w:tc>
+          <w:tcPr>
+            <w:tcW w:type="dxa" w:w="1340"/>
+          </w:tcPr>
+          <w:p>
+            <w:r>
+              <w:rPr>
+                <w:b w:val="false"/>
+                <w:bCs w:val="false"/>
+              </w:rPr>
+              <w:t xml:space="preserve">439,34</w:t>
+            </w:r>
+          </w:p>
+        </w:tc>
+      </w:tr>
+      <w:tr>
+        <w:tc>
+          <w:tcPr>
+            <w:tcW w:type="dxa" w:w="1340"/>
           </w:tcPr>
           <w:p>
             <w:r>
@@ -941,7 +1250,7 @@
         </w:tc>
         <w:tc>
           <w:tcPr>
-            <w:tcW w:type="dxa" w:w="1560"/>
+            <w:tcW w:type="dxa" w:w="1340"/>
           </w:tcPr>
           <w:p>
             <w:r>
@@ -955,7 +1264,7 @@
         </w:tc>
         <w:tc>
           <w:tcPr>
-            <w:tcW w:type="dxa" w:w="1560"/>
+            <w:tcW w:type="dxa" w:w="1340"/>
           </w:tcPr>
           <w:p>
             <w:r>
@@ -969,7 +1278,7 @@
         </w:tc>
         <w:tc>
           <w:tcPr>
-            <w:tcW w:type="dxa" w:w="1560"/>
+            <w:tcW w:type="dxa" w:w="1340"/>
           </w:tcPr>
           <w:p>
             <w:r>
@@ -983,7 +1292,7 @@
         </w:tc>
         <w:tc>
           <w:tcPr>
-            <w:tcW w:type="dxa" w:w="1560"/>
+            <w:tcW w:type="dxa" w:w="1340"/>
           </w:tcPr>
           <w:p>
             <w:r>
@@ -997,7 +1306,7 @@
         </w:tc>
         <w:tc>
           <w:tcPr>
-            <w:tcW w:type="dxa" w:w="1560"/>
+            <w:tcW w:type="dxa" w:w="1340"/>
           </w:tcPr>
           <w:p>
             <w:r>
@@ -1006,6 +1315,20 @@
                 <w:bCs w:val="false"/>
               </w:rPr>
               <w:t xml:space="preserve">0,885</w:t>
+            </w:r>
+          </w:p>
+        </w:tc>
+        <w:tc>
+          <w:tcPr>
+            <w:tcW w:type="dxa" w:w="1340"/>
+          </w:tcPr>
+          <w:p>
+            <w:r>
+              <w:rPr>
+                <w:b w:val="false"/>
+                <w:bCs w:val="false"/>
+              </w:rPr>
+              <w:t xml:space="preserve">0,888</w:t>
             </w:r>
           </w:p>
         </w:tc>
@@ -1017,7 +1340,7 @@
         <w:spacing w:after="150" w:before="300"/>
       </w:pPr>
       <w:r>
-        <w:t xml:space="preserve">9. Limitación Conocida (Aceptada)</w:t>
+        <w:t xml:space="preserve">10. Limitación Conocida (Aceptada)</w:t>
       </w:r>
     </w:p>
     <w:p>
@@ -1025,7 +1348,7 @@
         <w:spacing w:after="160"/>
       </w:pPr>
       <w:r>
-        <w:t xml:space="preserve">En todas las versiones válidas, el modelo subestima los pozos con picos de producción muy altos (posibles eventos de reestimulación/refractura). Se probaron dos enfoques distintos para resolverlo y ninguno mejoró el resultado — uno incluso lo empeoró de forma más grave. Esto sugiere que el problema no es de ingeniería sobre los datos disponibles, sino de ausencia de una variable que el dataset no incluye (por ejemplo, si se programó una intervención en el pozo). Se documenta como limitación conocida y se avanza con evidencia en mano.</w:t>
+        <w:t xml:space="preserve">En todas las versiones válidas (XGBoost y LightGBM por igual), el modelo subestima los pozos con picos de producción muy altos (posibles eventos de reestimulación/refractura). Se probaron tres enfoques distintos para resolverlo (una variable nueva, un cambio de objetivo de entrenamiento, y un segundo algoritmo) y ninguno lo resolvió de fondo. Esto sugiere que el problema no es de ingeniería sobre los datos disponibles ni de elección de algoritmo, sino de ausencia de una variable que el dataset no incluye (por ejemplo, si se programó una intervención en el pozo). Se documenta como limitación conocida y se avanza con evidencia en mano.</w:t>
       </w:r>
     </w:p>
     <w:p>
@@ -1033,7 +1356,7 @@
         <w:spacing w:after="160"/>
       </w:pPr>
       <w:r>
-        <w:t xml:space="preserve">El modelo final se guardó en models/modelo_produccion_pet.joblib.</w:t>
+        <w:t xml:space="preserve">El modelo final (LightGBM) se guardó en models/modelo_produccion_pet.joblib.</w:t>
       </w:r>
     </w:p>
     <w:p>
@@ -1042,7 +1365,7 @@
         <w:spacing w:after="150" w:before="300"/>
       </w:pPr>
       <w:r>
-        <w:t xml:space="preserve">10. Próximos Pasos</w:t>
+        <w:t xml:space="preserve">11. Próximos Pasos</w:t>
       </w:r>
     </w:p>
     <w:p>

</xml_diff>

<commit_message>
Notebook 03: correccion de fuga en ratio_gas_petroleo, baseline y modelo de variacion
</commit_message>
<xml_diff>
--- a/reports/Pre_Entrega_3_YPF.docx
+++ b/reports/Pre_Entrega_3_YPF.docx
@@ -1356,7 +1356,17 @@
         <w:spacing w:after="160"/>
       </w:pPr>
       <w:r>
-        <w:t xml:space="preserve">El modelo final (LightGBM) se guardó en models/modelo_produccion_pet.joblib.</w:t>
+        <w:t xml:space="preserve">El modelo LightGBM de 8 variables (Iteración 6) se guardó en models/modelo_produccion_pet_lightgbm.joblib. </w:t>
+      </w:r>
+      <w:r>
+        <w:rPr>
+          <w:b/>
+          <w:bCs/>
+        </w:rPr>
+        <w:t xml:space="preserve">Nota posterior:</w:t>
+      </w:r>
+      <w:r>
+        <w:t xml:space="preserve"> fue reemplazado como modelo principal por el de la Iteración 8 (secciones 11 a 13), porque usaba una variable con fuga de datos.</w:t>
       </w:r>
     </w:p>
     <w:p>
@@ -1365,7 +1375,783 @@
         <w:spacing w:after="150" w:before="300"/>
       </w:pPr>
       <w:r>
-        <w:t xml:space="preserve">11. Próximos Pasos</w:t>
+        <w:t xml:space="preserve">11. Iteración 7 — Fuga de Datos en ratio_gas_petroleo (Detectada y Corregida)</w:t>
+      </w:r>
+    </w:p>
+    <w:p>
+      <w:pPr>
+        <w:spacing w:after="160"/>
+      </w:pPr>
+      <w:r>
+        <w:t xml:space="preserve">Al aplicar SHAP sobre el modelo (notebooks/05_explicabilidad_shap_dl.ipynb), ratio_gas_petroleo apareció como la segunda variable más importante (SHAP promedio de 110,6 contra 619,1 de la primera). Al revisar su definición se verificó que </w:t>
+      </w:r>
+      <w:r>
+        <w:rPr>
+          <w:b/>
+          <w:bCs/>
+        </w:rPr>
+        <w:t xml:space="preserve">ratio_gas_petroleo = prod_gas / prod_pet del mismo mes que se quiere predecir</w:t>
+      </w:r>
+      <w:r>
+        <w:t xml:space="preserve"> (coincide en el 100% de las filas): la producción de petróleo a predecir queda en el denominador, de modo que el modelo puede aproximar la respuesta (prod_pet ≈ gas del mes anterior / ratio). Además, ese dato no existe al momento de predecir el mes siguiente, por lo que el modelo no era utilizable en la API tal como estaba planteado.</w:t>
+      </w:r>
+    </w:p>
+    <w:p>
+      <w:pPr>
+        <w:spacing w:after="160"/>
+      </w:pPr>
+      <w:r>
+        <w:rPr>
+          <w:b/>
+          <w:bCs/>
+        </w:rPr>
+        <w:t xml:space="preserve">Corrección:</w:t>
+      </w:r>
+      <w:r>
+        <w:t xml:space="preserve"> se reemplazó por ratio_gas_petroleo_anterior (ratio del mes anterior, shift(1) por pozo). Las iteraciones 1 a 6 usaban la versión con fuga; sus comparaciones relativas siguen siendo válidas, pero ese modelo ya no es el vigente.</w:t>
+      </w:r>
+    </w:p>
+    <w:p>
+      <w:pPr>
+        <w:spacing w:after="160"/>
+      </w:pPr>
+      <w:r>
+        <w:rPr>
+          <w:b/>
+          <w:bCs/>
+        </w:rPr>
+        <w:t xml:space="preserve">Baseline de referencia:</w:t>
+      </w:r>
+      <w:r>
+        <w:t xml:space="preserve"> se incorporó un baseline simple, que predice que cada mes produce lo mismo que el mes anterior, para medir cuánto aporta realmente el modelo.</w:t>
+      </w:r>
+    </w:p>
+    <w:tbl>
+      <w:tblPr>
+        <w:tblW w:type="dxa" w:w="9360"/>
+        <w:tblBorders>
+          <w:top w:val="single" w:color="auto" w:sz="4"/>
+          <w:left w:val="single" w:color="auto" w:sz="4"/>
+          <w:bottom w:val="single" w:color="auto" w:sz="4"/>
+          <w:right w:val="single" w:color="auto" w:sz="4"/>
+          <w:insideH w:val="single" w:color="auto" w:sz="4"/>
+          <w:insideV w:val="single" w:color="auto" w:sz="4"/>
+        </w:tblBorders>
+      </w:tblPr>
+      <w:tblGrid>
+        <w:gridCol w:w="2600"/>
+        <w:gridCol w:w="2200"/>
+        <w:gridCol w:w="2360"/>
+        <w:gridCol w:w="2200"/>
+      </w:tblGrid>
+      <w:tr>
+        <w:tc>
+          <w:tcPr>
+            <w:tcW w:type="dxa" w:w="2600"/>
+            <w:shd w:fill="D9E2F3" w:val="clear"/>
+          </w:tcPr>
+          <w:p>
+            <w:r>
+              <w:rPr>
+                <w:b/>
+                <w:bCs/>
+              </w:rPr>
+              <w:t xml:space="preserve">Métrica</w:t>
+            </w:r>
+          </w:p>
+        </w:tc>
+        <w:tc>
+          <w:tcPr>
+            <w:tcW w:type="dxa" w:w="2200"/>
+            <w:shd w:fill="D9E2F3" w:val="clear"/>
+          </w:tcPr>
+          <w:p>
+            <w:r>
+              <w:rPr>
+                <w:b/>
+                <w:bCs/>
+              </w:rPr>
+              <w:t xml:space="preserve">Baseline (mes anterior)</w:t>
+            </w:r>
+          </w:p>
+        </w:tc>
+        <w:tc>
+          <w:tcPr>
+            <w:tcW w:type="dxa" w:w="2360"/>
+            <w:shd w:fill="D9E2F3" w:val="clear"/>
+          </w:tcPr>
+          <w:p>
+            <w:r>
+              <w:rPr>
+                <w:b/>
+                <w:bCs/>
+              </w:rPr>
+              <w:t xml:space="preserve">LightGBM Iteración 6 (con fuga)*</w:t>
+            </w:r>
+          </w:p>
+        </w:tc>
+        <w:tc>
+          <w:tcPr>
+            <w:tcW w:type="dxa" w:w="2200"/>
+            <w:shd w:fill="D9E2F3" w:val="clear"/>
+          </w:tcPr>
+          <w:p>
+            <w:r>
+              <w:rPr>
+                <w:b/>
+                <w:bCs/>
+              </w:rPr>
+              <w:t xml:space="preserve">LightGBM Iteración 7 (sin fuga)</w:t>
+            </w:r>
+          </w:p>
+        </w:tc>
+      </w:tr>
+      <w:tr>
+        <w:tc>
+          <w:tcPr>
+            <w:tcW w:type="dxa" w:w="2600"/>
+          </w:tcPr>
+          <w:p>
+            <w:r>
+              <w:rPr>
+                <w:b w:val="false"/>
+                <w:bCs w:val="false"/>
+              </w:rPr>
+              <w:t xml:space="preserve">MAE</w:t>
+            </w:r>
+          </w:p>
+        </w:tc>
+        <w:tc>
+          <w:tcPr>
+            <w:tcW w:type="dxa" w:w="2200"/>
+          </w:tcPr>
+          <w:p>
+            <w:r>
+              <w:rPr>
+                <w:b w:val="false"/>
+                <w:bCs w:val="false"/>
+              </w:rPr>
+              <w:t xml:space="preserve">171,77</w:t>
+            </w:r>
+          </w:p>
+        </w:tc>
+        <w:tc>
+          <w:tcPr>
+            <w:tcW w:type="dxa" w:w="2360"/>
+          </w:tcPr>
+          <w:p>
+            <w:r>
+              <w:rPr>
+                <w:b w:val="false"/>
+                <w:bCs w:val="false"/>
+              </w:rPr>
+              <w:t xml:space="preserve">163,86</w:t>
+            </w:r>
+          </w:p>
+        </w:tc>
+        <w:tc>
+          <w:tcPr>
+            <w:tcW w:type="dxa" w:w="2200"/>
+          </w:tcPr>
+          <w:p>
+            <w:r>
+              <w:rPr>
+                <w:b w:val="false"/>
+                <w:bCs w:val="false"/>
+              </w:rPr>
+              <w:t xml:space="preserve">163,73</w:t>
+            </w:r>
+          </w:p>
+        </w:tc>
+      </w:tr>
+      <w:tr>
+        <w:tc>
+          <w:tcPr>
+            <w:tcW w:type="dxa" w:w="2600"/>
+          </w:tcPr>
+          <w:p>
+            <w:r>
+              <w:rPr>
+                <w:b w:val="false"/>
+                <w:bCs w:val="false"/>
+              </w:rPr>
+              <w:t xml:space="preserve">RMSE</w:t>
+            </w:r>
+          </w:p>
+        </w:tc>
+        <w:tc>
+          <w:tcPr>
+            <w:tcW w:type="dxa" w:w="2200"/>
+          </w:tcPr>
+          <w:p>
+            <w:r>
+              <w:rPr>
+                <w:b w:val="false"/>
+                <w:bCs w:val="false"/>
+              </w:rPr>
+              <w:t xml:space="preserve">458,11</w:t>
+            </w:r>
+          </w:p>
+        </w:tc>
+        <w:tc>
+          <w:tcPr>
+            <w:tcW w:type="dxa" w:w="2360"/>
+          </w:tcPr>
+          <w:p>
+            <w:r>
+              <w:rPr>
+                <w:b w:val="false"/>
+                <w:bCs w:val="false"/>
+              </w:rPr>
+              <w:t xml:space="preserve">439,34</w:t>
+            </w:r>
+          </w:p>
+        </w:tc>
+        <w:tc>
+          <w:tcPr>
+            <w:tcW w:type="dxa" w:w="2200"/>
+          </w:tcPr>
+          <w:p>
+            <w:r>
+              <w:rPr>
+                <w:b/>
+                <w:bCs/>
+              </w:rPr>
+              <w:t xml:space="preserve">431,11</w:t>
+            </w:r>
+          </w:p>
+        </w:tc>
+      </w:tr>
+      <w:tr>
+        <w:tc>
+          <w:tcPr>
+            <w:tcW w:type="dxa" w:w="2600"/>
+          </w:tcPr>
+          <w:p>
+            <w:r>
+              <w:rPr>
+                <w:b w:val="false"/>
+                <w:bCs w:val="false"/>
+              </w:rPr>
+              <w:t xml:space="preserve">R²</w:t>
+            </w:r>
+          </w:p>
+        </w:tc>
+        <w:tc>
+          <w:tcPr>
+            <w:tcW w:type="dxa" w:w="2200"/>
+          </w:tcPr>
+          <w:p>
+            <w:r>
+              <w:rPr>
+                <w:b w:val="false"/>
+                <w:bCs w:val="false"/>
+              </w:rPr>
+              <w:t xml:space="preserve">0,877</w:t>
+            </w:r>
+          </w:p>
+        </w:tc>
+        <w:tc>
+          <w:tcPr>
+            <w:tcW w:type="dxa" w:w="2360"/>
+          </w:tcPr>
+          <w:p>
+            <w:r>
+              <w:rPr>
+                <w:b w:val="false"/>
+                <w:bCs w:val="false"/>
+              </w:rPr>
+              <w:t xml:space="preserve">0,888</w:t>
+            </w:r>
+          </w:p>
+        </w:tc>
+        <w:tc>
+          <w:tcPr>
+            <w:tcW w:type="dxa" w:w="2200"/>
+          </w:tcPr>
+          <w:p>
+            <w:r>
+              <w:rPr>
+                <w:b/>
+                <w:bCs/>
+              </w:rPr>
+              <w:t xml:space="preserve">0,892</w:t>
+            </w:r>
+          </w:p>
+        </w:tc>
+      </w:tr>
+      <w:tr>
+        <w:tc>
+          <w:tcPr>
+            <w:tcW w:type="dxa" w:w="2600"/>
+          </w:tcPr>
+          <w:p>
+            <w:r>
+              <w:rPr>
+                <w:b w:val="false"/>
+                <w:bCs w:val="false"/>
+              </w:rPr>
+              <w:t xml:space="preserve">Error medio en picos (&gt;10.000)</w:t>
+            </w:r>
+          </w:p>
+        </w:tc>
+        <w:tc>
+          <w:tcPr>
+            <w:tcW w:type="dxa" w:w="2200"/>
+          </w:tcPr>
+          <w:p>
+            <w:r>
+              <w:rPr>
+                <w:b w:val="false"/>
+                <w:bCs w:val="false"/>
+              </w:rPr>
+              <w:t xml:space="preserve">1.996,5</w:t>
+            </w:r>
+          </w:p>
+        </w:tc>
+        <w:tc>
+          <w:tcPr>
+            <w:tcW w:type="dxa" w:w="2360"/>
+          </w:tcPr>
+          <w:p>
+            <w:r>
+              <w:rPr>
+                <w:b w:val="false"/>
+                <w:bCs w:val="false"/>
+              </w:rPr>
+              <w:t xml:space="preserve">4.998,2</w:t>
+            </w:r>
+          </w:p>
+        </w:tc>
+        <w:tc>
+          <w:tcPr>
+            <w:tcW w:type="dxa" w:w="2200"/>
+          </w:tcPr>
+          <w:p>
+            <w:r>
+              <w:rPr>
+                <w:b w:val="false"/>
+                <w:bCs w:val="false"/>
+              </w:rPr>
+              <w:t xml:space="preserve">4.511,2</w:t>
+            </w:r>
+          </w:p>
+        </w:tc>
+      </w:tr>
+    </w:tbl>
+    <w:p>
+      <w:pPr>
+        <w:spacing w:after="200"/>
+      </w:pPr>
+    </w:p>
+    <w:p>
+      <w:pPr>
+        <w:spacing w:after="160"/>
+      </w:pPr>
+      <w:r>
+        <w:t xml:space="preserve">*La Iteración 6 se evaluó sobre 65.170 filas de prueba; el baseline y la Iteración 7 sobre 65.802, porque al usar el ratio del mes anterior ya no se descartan los meses con producción cero. </w:t>
+      </w:r>
+      <w:r>
+        <w:rPr>
+          <w:b/>
+          <w:bCs/>
+        </w:rPr>
+        <w:t xml:space="preserve">Resultado:</w:t>
+      </w:r>
+      <w:r>
+        <w:t xml:space="preserve"> corregir la fuga no empeora el modelo (mejora levemente), y el modelo supera al baseline por un margen modesto. En los picos altos, repetir el mes anterior sigue siendo mejor que el modelo.</w:t>
+      </w:r>
+    </w:p>
+    <w:p>
+      <w:pPr>
+        <w:pStyle w:val="Heading1"/>
+        <w:spacing w:after="150" w:before="300"/>
+      </w:pPr>
+      <w:r>
+        <w:t xml:space="preserve">12. Iteración 8 — Predecir la Variación en lugar del Nivel</w:t>
+      </w:r>
+    </w:p>
+    <w:p>
+      <w:pPr>
+        <w:spacing w:after="160"/>
+      </w:pPr>
+      <w:r>
+        <w:t xml:space="preserve">SHAP mostró que el modelo se apoya casi por completo en prod_pet_mes_anterior y que, en los picos, su aporte se aplana. Los modelos de árboles no pueden predecir por encima de lo que vieron al entrenar: el máximo de producción en entrenamiento (hasta 2023) fue 15.943, con solo 36 filas sobre 10.000 entre 169.097, mientras que en el período de prueba hay picos de hasta 26.593.</w:t>
+      </w:r>
+    </w:p>
+    <w:p>
+      <w:pPr>
+        <w:spacing w:after="160"/>
+      </w:pPr>
+      <w:r>
+        <w:t xml:space="preserve">Se cambió el objetivo: el modelo predice </w:t>
+      </w:r>
+      <w:r>
+        <w:rPr>
+          <w:b/>
+          <w:bCs/>
+        </w:rPr>
+        <w:t xml:space="preserve">cuánto cambia la producción respecto del mes anterior</w:t>
+      </w:r>
+      <w:r>
+        <w:t xml:space="preserve"> (prod_pet − prod_pet_mes_anterior), y la predicción final se obtiene sumando ese cambio al mes anterior y recortando en 0 (3.437 de las 65.802 predicciones, el 5,2%, eran negativas antes del recorte).</w:t>
+      </w:r>
+    </w:p>
+    <w:tbl>
+      <w:tblPr>
+        <w:tblW w:type="dxa" w:w="9360"/>
+        <w:tblBorders>
+          <w:top w:val="single" w:color="auto" w:sz="4"/>
+          <w:left w:val="single" w:color="auto" w:sz="4"/>
+          <w:bottom w:val="single" w:color="auto" w:sz="4"/>
+          <w:right w:val="single" w:color="auto" w:sz="4"/>
+          <w:insideH w:val="single" w:color="auto" w:sz="4"/>
+          <w:insideV w:val="single" w:color="auto" w:sz="4"/>
+        </w:tblBorders>
+      </w:tblPr>
+      <w:tblGrid>
+        <w:gridCol w:w="2600"/>
+        <w:gridCol w:w="2200"/>
+        <w:gridCol w:w="2200"/>
+        <w:gridCol w:w="2360"/>
+      </w:tblGrid>
+      <w:tr>
+        <w:tc>
+          <w:tcPr>
+            <w:tcW w:type="dxa" w:w="2600"/>
+            <w:shd w:fill="D9E2F3" w:val="clear"/>
+          </w:tcPr>
+          <w:p>
+            <w:r>
+              <w:rPr>
+                <w:b/>
+                <w:bCs/>
+              </w:rPr>
+              <w:t xml:space="preserve">Métrica</w:t>
+            </w:r>
+          </w:p>
+        </w:tc>
+        <w:tc>
+          <w:tcPr>
+            <w:tcW w:type="dxa" w:w="2200"/>
+            <w:shd w:fill="D9E2F3" w:val="clear"/>
+          </w:tcPr>
+          <w:p>
+            <w:r>
+              <w:rPr>
+                <w:b/>
+                <w:bCs/>
+              </w:rPr>
+              <w:t xml:space="preserve">Baseline (mes anterior)</w:t>
+            </w:r>
+          </w:p>
+        </w:tc>
+        <w:tc>
+          <w:tcPr>
+            <w:tcW w:type="dxa" w:w="2200"/>
+            <w:shd w:fill="D9E2F3" w:val="clear"/>
+          </w:tcPr>
+          <w:p>
+            <w:r>
+              <w:rPr>
+                <w:b/>
+                <w:bCs/>
+              </w:rPr>
+              <w:t xml:space="preserve">LightGBM Iteración 7</w:t>
+            </w:r>
+          </w:p>
+        </w:tc>
+        <w:tc>
+          <w:tcPr>
+            <w:tcW w:type="dxa" w:w="2360"/>
+            <w:shd w:fill="D9E2F3" w:val="clear"/>
+          </w:tcPr>
+          <w:p>
+            <w:r>
+              <w:rPr>
+                <w:b/>
+                <w:bCs/>
+              </w:rPr>
+              <w:t xml:space="preserve">LightGBM Iteración 8 (variación)</w:t>
+            </w:r>
+          </w:p>
+        </w:tc>
+      </w:tr>
+      <w:tr>
+        <w:tc>
+          <w:tcPr>
+            <w:tcW w:type="dxa" w:w="2600"/>
+          </w:tcPr>
+          <w:p>
+            <w:r>
+              <w:rPr>
+                <w:b w:val="false"/>
+                <w:bCs w:val="false"/>
+              </w:rPr>
+              <w:t xml:space="preserve">MAE</w:t>
+            </w:r>
+          </w:p>
+        </w:tc>
+        <w:tc>
+          <w:tcPr>
+            <w:tcW w:type="dxa" w:w="2200"/>
+          </w:tcPr>
+          <w:p>
+            <w:r>
+              <w:rPr>
+                <w:b w:val="false"/>
+                <w:bCs w:val="false"/>
+              </w:rPr>
+              <w:t xml:space="preserve">171,77</w:t>
+            </w:r>
+          </w:p>
+        </w:tc>
+        <w:tc>
+          <w:tcPr>
+            <w:tcW w:type="dxa" w:w="2200"/>
+          </w:tcPr>
+          <w:p>
+            <w:r>
+              <w:rPr>
+                <w:b w:val="false"/>
+                <w:bCs w:val="false"/>
+              </w:rPr>
+              <w:t xml:space="preserve">163,73</w:t>
+            </w:r>
+          </w:p>
+        </w:tc>
+        <w:tc>
+          <w:tcPr>
+            <w:tcW w:type="dxa" w:w="2360"/>
+          </w:tcPr>
+          <w:p>
+            <w:r>
+              <w:rPr>
+                <w:b/>
+                <w:bCs/>
+              </w:rPr>
+              <w:t xml:space="preserve">160,02</w:t>
+            </w:r>
+          </w:p>
+        </w:tc>
+      </w:tr>
+      <w:tr>
+        <w:tc>
+          <w:tcPr>
+            <w:tcW w:type="dxa" w:w="2600"/>
+          </w:tcPr>
+          <w:p>
+            <w:r>
+              <w:rPr>
+                <w:b w:val="false"/>
+                <w:bCs w:val="false"/>
+              </w:rPr>
+              <w:t xml:space="preserve">RMSE</w:t>
+            </w:r>
+          </w:p>
+        </w:tc>
+        <w:tc>
+          <w:tcPr>
+            <w:tcW w:type="dxa" w:w="2200"/>
+          </w:tcPr>
+          <w:p>
+            <w:r>
+              <w:rPr>
+                <w:b w:val="false"/>
+                <w:bCs w:val="false"/>
+              </w:rPr>
+              <w:t xml:space="preserve">458,11</w:t>
+            </w:r>
+          </w:p>
+        </w:tc>
+        <w:tc>
+          <w:tcPr>
+            <w:tcW w:type="dxa" w:w="2200"/>
+          </w:tcPr>
+          <w:p>
+            <w:r>
+              <w:rPr>
+                <w:b w:val="false"/>
+                <w:bCs w:val="false"/>
+              </w:rPr>
+              <w:t xml:space="preserve">431,11</w:t>
+            </w:r>
+          </w:p>
+        </w:tc>
+        <w:tc>
+          <w:tcPr>
+            <w:tcW w:type="dxa" w:w="2360"/>
+          </w:tcPr>
+          <w:p>
+            <w:r>
+              <w:rPr>
+                <w:b/>
+                <w:bCs/>
+              </w:rPr>
+              <w:t xml:space="preserve">411,24</w:t>
+            </w:r>
+          </w:p>
+        </w:tc>
+      </w:tr>
+      <w:tr>
+        <w:tc>
+          <w:tcPr>
+            <w:tcW w:type="dxa" w:w="2600"/>
+          </w:tcPr>
+          <w:p>
+            <w:r>
+              <w:rPr>
+                <w:b w:val="false"/>
+                <w:bCs w:val="false"/>
+              </w:rPr>
+              <w:t xml:space="preserve">R²</w:t>
+            </w:r>
+          </w:p>
+        </w:tc>
+        <w:tc>
+          <w:tcPr>
+            <w:tcW w:type="dxa" w:w="2200"/>
+          </w:tcPr>
+          <w:p>
+            <w:r>
+              <w:rPr>
+                <w:b w:val="false"/>
+                <w:bCs w:val="false"/>
+              </w:rPr>
+              <w:t xml:space="preserve">0,877</w:t>
+            </w:r>
+          </w:p>
+        </w:tc>
+        <w:tc>
+          <w:tcPr>
+            <w:tcW w:type="dxa" w:w="2200"/>
+          </w:tcPr>
+          <w:p>
+            <w:r>
+              <w:rPr>
+                <w:b w:val="false"/>
+                <w:bCs w:val="false"/>
+              </w:rPr>
+              <w:t xml:space="preserve">0,892</w:t>
+            </w:r>
+          </w:p>
+        </w:tc>
+        <w:tc>
+          <w:tcPr>
+            <w:tcW w:type="dxa" w:w="2360"/>
+          </w:tcPr>
+          <w:p>
+            <w:r>
+              <w:rPr>
+                <w:b/>
+                <w:bCs/>
+              </w:rPr>
+              <w:t xml:space="preserve">0,901</w:t>
+            </w:r>
+          </w:p>
+        </w:tc>
+      </w:tr>
+      <w:tr>
+        <w:tc>
+          <w:tcPr>
+            <w:tcW w:type="dxa" w:w="2600"/>
+          </w:tcPr>
+          <w:p>
+            <w:r>
+              <w:rPr>
+                <w:b w:val="false"/>
+                <w:bCs w:val="false"/>
+              </w:rPr>
+              <w:t xml:space="preserve">Error medio en picos (&gt;10.000)</w:t>
+            </w:r>
+          </w:p>
+        </w:tc>
+        <w:tc>
+          <w:tcPr>
+            <w:tcW w:type="dxa" w:w="2200"/>
+          </w:tcPr>
+          <w:p>
+            <w:r>
+              <w:rPr>
+                <w:b w:val="false"/>
+                <w:bCs w:val="false"/>
+              </w:rPr>
+              <w:t xml:space="preserve">1.996,5</w:t>
+            </w:r>
+          </w:p>
+        </w:tc>
+        <w:tc>
+          <w:tcPr>
+            <w:tcW w:type="dxa" w:w="2200"/>
+          </w:tcPr>
+          <w:p>
+            <w:r>
+              <w:rPr>
+                <w:b w:val="false"/>
+                <w:bCs w:val="false"/>
+              </w:rPr>
+              <w:t xml:space="preserve">4.511,2</w:t>
+            </w:r>
+          </w:p>
+        </w:tc>
+        <w:tc>
+          <w:tcPr>
+            <w:tcW w:type="dxa" w:w="2360"/>
+          </w:tcPr>
+          <w:p>
+            <w:r>
+              <w:rPr>
+                <w:b w:val="false"/>
+                <w:bCs w:val="false"/>
+              </w:rPr>
+              <w:t xml:space="preserve">3.123,3</w:t>
+            </w:r>
+          </w:p>
+        </w:tc>
+      </w:tr>
+    </w:tbl>
+    <w:p>
+      <w:pPr>
+        <w:spacing w:after="200"/>
+      </w:pPr>
+    </w:p>
+    <w:p>
+      <w:pPr>
+        <w:spacing w:after="160"/>
+      </w:pPr>
+      <w:r>
+        <w:rPr>
+          <w:b/>
+          <w:bCs/>
+        </w:rPr>
+        <w:t xml:space="preserve">Resultado:</w:t>
+      </w:r>
+      <w:r>
+        <w:t xml:space="preserve"> mejora las cuatro métricas respecto de la Iteración 7 y reduce el error en picos, aunque sigue siendo peor que el baseline en los meses de producción extrema.</w:t>
+      </w:r>
+    </w:p>
+    <w:p>
+      <w:pPr>
+        <w:pStyle w:val="Heading1"/>
+        <w:spacing w:after="150" w:before="300"/>
+      </w:pPr>
+      <w:r>
+        <w:t xml:space="preserve">13. Modelo Final Vigente y Limitación Revisada</w:t>
+      </w:r>
+    </w:p>
+    <w:p>
+      <w:pPr>
+        <w:spacing w:after="160"/>
+      </w:pPr>
+      <w:r>
+        <w:rPr>
+          <w:b/>
+          <w:bCs/>
+        </w:rPr>
+        <w:t xml:space="preserve">Modelo final:</w:t>
+      </w:r>
+      <w:r>
+        <w:t xml:space="preserve"> LightGBM (Iteración 8), con las 8 variables antiguedad_meses, prod_pet_mes_anterior, prod_gas_mes_anterior, declinacion_pet_anterior, ratio_gas_petroleo_anterior, profundidad, formacion_cod y cuenca_cod. Predice la variación respecto del mes anterior: la producción se obtiene como prod_pet_mes_anterior + variación predicha, con piso en 0. Métricas: MAE 160,02 — RMSE 411,24 — R² 0,901.</w:t>
       </w:r>
     </w:p>
     <w:p>
@@ -1378,7 +2164,7 @@
         <w:spacing w:after="80"/>
       </w:pPr>
       <w:r>
-        <w:t xml:space="preserve">notebooks/04_modelado_no_supervisado_dl.ipynb: clustering (K-Means) de pozos según su curva de producción/declinación — los pozos con picos son candidatos a revisar como grupo aparte.</w:t>
+        <w:t xml:space="preserve">models/modelo_produccion_pet.joblib: modelo principal vigente (Iteración 8). Reemplaza al guardado en la Pre-Entrega 3.</w:t>
       </w:r>
     </w:p>
     <w:p>
@@ -1391,7 +2177,7 @@
         <w:spacing w:after="80"/>
       </w:pPr>
       <w:r>
-        <w:t xml:space="preserve">Explicabilidad (SHAP) sobre el modelo de regresión final.</w:t>
+        <w:t xml:space="preserve">models/columnas_features.joblib: lista de variables que espera el modelo (para la API).</w:t>
       </w:r>
     </w:p>
     <w:p>
@@ -1404,7 +2190,88 @@
         <w:spacing w:after="80"/>
       </w:pPr>
       <w:r>
-        <w:t xml:space="preserve">Entrega Final: API en FastAPI, Dockerfile y documentación completa en README.md.</w:t>
+        <w:t xml:space="preserve">models/modelo_produccion_pet_lightgbm_v7.joblib y models/modelo_produccion_pet_lightgbm_v8.joblib: versiones de las iteraciones 7 y 8.</w:t>
+      </w:r>
+    </w:p>
+    <w:p>
+      <w:pPr>
+        <w:pStyle w:val="ListParagraph"/>
+        <w:numPr>
+          <w:ilvl w:val="0"/>
+          <w:numId w:val="1"/>
+        </w:numPr>
+        <w:spacing w:after="80"/>
+      </w:pPr>
+      <w:r>
+        <w:t xml:space="preserve">Los modelos XGBoost y LightGBM de las secciones 8 y 9 se conservan solo por trazabilidad: usan la variable con fuga.</w:t>
+      </w:r>
+    </w:p>
+    <w:p>
+      <w:pPr>
+        <w:spacing w:after="200"/>
+      </w:pPr>
+    </w:p>
+    <w:p>
+      <w:pPr>
+        <w:spacing w:after="160"/>
+      </w:pPr>
+      <w:r>
+        <w:rPr>
+          <w:b/>
+          <w:bCs/>
+        </w:rPr>
+        <w:t xml:space="preserve">Limitación revisada:</w:t>
+      </w:r>
+      <w:r>
+        <w:t xml:space="preserve"> en la sección 10 se atribuía la subestimación de picos a la ausencia de una variable de intervención. La evidencia posterior agrega una causa verificable: el modelo casi no vio producciones altas al entrenar y los árboles no extrapolan (máximo de 15.943 en entrenamiento contra 26.593 en prueba). Ambas explicaciones pueden coexistir; la hipótesis de reestimulación no se confirma ni se descarta con los datos disponibles. En los picos extremos, repetir el mes anterior sigue siendo mejor que el modelo, y se documenta como limitación aceptada.</w:t>
+      </w:r>
+    </w:p>
+    <w:p>
+      <w:pPr>
+        <w:pStyle w:val="Heading1"/>
+        <w:spacing w:after="150" w:before="300"/>
+      </w:pPr>
+      <w:r>
+        <w:t xml:space="preserve">14. Próximos Pasos</w:t>
+      </w:r>
+    </w:p>
+    <w:p>
+      <w:pPr>
+        <w:pStyle w:val="ListParagraph"/>
+        <w:numPr>
+          <w:ilvl w:val="0"/>
+          <w:numId w:val="1"/>
+        </w:numPr>
+        <w:spacing w:after="80"/>
+      </w:pPr>
+      <w:r>
+        <w:t xml:space="preserve">Optimización de hiperparámetros (Optuna) sobre el modelo final, con validación temporal.</w:t>
+      </w:r>
+    </w:p>
+    <w:p>
+      <w:pPr>
+        <w:pStyle w:val="ListParagraph"/>
+        <w:numPr>
+          <w:ilvl w:val="0"/>
+          <w:numId w:val="1"/>
+        </w:numPr>
+        <w:spacing w:after="80"/>
+      </w:pPr>
+      <w:r>
+        <w:t xml:space="preserve">Explicabilidad (SHAP) sobre el modelo final: el análisis actual se hizo sobre el modelo de la Iteración 6 y debe repetirse sobre el vigente.</w:t>
+      </w:r>
+    </w:p>
+    <w:p>
+      <w:pPr>
+        <w:pStyle w:val="ListParagraph"/>
+        <w:numPr>
+          <w:ilvl w:val="0"/>
+          <w:numId w:val="1"/>
+        </w:numPr>
+        <w:spacing w:after="80"/>
+      </w:pPr>
+      <w:r>
+        <w:t xml:space="preserve">Entrega Final: src/train.py, src/predict.py (que aplique prod_pet_mes_anterior + variación, con piso en 0), API en FastAPI, Dockerfile y documentación completa en README.md.</w:t>
       </w:r>
     </w:p>
     <w:sectPr>

</xml_diff>